<commit_message>
Nhat Sua Font Lung Tung
</commit_message>
<xml_diff>
--- a/a.docx
+++ b/a.docx
@@ -610,6 +610,7 @@
         <w:spacing w:line="240" w:lineRule="auto"/>
         <w:rPr>
           <w:rFonts w:cstheme="minorHAnsi"/>
+          <w:lang w:val="vi-VN"/>
         </w:rPr>
       </w:pPr>
       <w:r>
@@ -617,12 +618,14 @@
           <w:rFonts w:cstheme="minorHAnsi"/>
           <w:b/>
           <w:bCs/>
+          <w:lang w:val="vi-VN"/>
         </w:rPr>
         <w:t>Từ chối / Xóa bài:</w:t>
       </w:r>
       <w:r>
         <w:rPr>
           <w:rFonts w:cstheme="minorHAnsi"/>
+          <w:lang w:val="vi-VN"/>
         </w:rPr>
         <w:t xml:space="preserve"> Trả bài kèm lý do hoặc xóa hẳn bài vi phạm.</w:t>
       </w:r>
@@ -636,6 +639,7 @@
         <w:spacing w:line="240" w:lineRule="auto"/>
         <w:rPr>
           <w:rFonts w:cstheme="minorHAnsi"/>
+          <w:lang w:val="vi-VN"/>
         </w:rPr>
       </w:pPr>
       <w:r>
@@ -643,12 +647,14 @@
           <w:rFonts w:cstheme="minorHAnsi"/>
           <w:b/>
           <w:bCs/>
+          <w:lang w:val="vi-VN"/>
         </w:rPr>
         <w:t>Quản lý Bài đã đăng:</w:t>
       </w:r>
       <w:r>
         <w:rPr>
           <w:rFonts w:cstheme="minorHAnsi"/>
+          <w:lang w:val="vi-VN"/>
         </w:rPr>
         <w:t xml:space="preserve"> Ghim bài lên vị trí Tin nổi bật (Có 3 vị trí nổi bật, còn lại xếp theo ngày đăng); đổi chuyên mục; ẩn hoặc hạ bài viết nếu phát hiện sai sót sau khi đăng. </w:t>
       </w:r>
@@ -657,6 +663,7 @@
           <w:rFonts w:cstheme="minorHAnsi"/>
           <w:i/>
           <w:iCs/>
+          <w:lang w:val="vi-VN"/>
         </w:rPr>
         <w:t>(Lưu ý: Vị trí nổi bật sẽ giữ trong 3 ngày nếu không được thay thế hoặc set lại; nếu không, vị trí nổi bật sẽ là bài mới nhất).</w:t>
       </w:r>
@@ -677,18 +684,21 @@
           <w:rFonts w:cstheme="minorHAnsi"/>
           <w:b/>
           <w:bCs/>
+          <w:lang w:val="vi-VN"/>
         </w:rPr>
         <w:t>Kiểm duyệt Quảng cáo:</w:t>
       </w:r>
       <w:r>
         <w:rPr>
           <w:rFonts w:cstheme="minorHAnsi"/>
+          <w:lang w:val="vi-VN"/>
         </w:rPr>
         <w:t xml:space="preserve"> Đánh giá nội dung/hình ảnh quảng cáo do Doanh nghiệp gửi lên trước </w:t>
       </w:r>
       <w:r>
         <w:rPr>
           <w:rFonts w:cstheme="minorHAnsi"/>
+          <w:lang w:val="vi-VN"/>
         </w:rPr>
         <w:t>khi</w:t>
       </w:r>
@@ -1336,6 +1346,284 @@
     <w:p>
       <w:pPr>
         <w:spacing w:line="240" w:lineRule="auto"/>
+        <w:rPr>
+          <w:rFonts w:cstheme="minorHAnsi"/>
+          <w:lang w:val="vi-VN"/>
+        </w:rPr>
+      </w:pPr>
+      <w:r>
+        <w:rPr>
+          <w:rFonts w:cstheme="minorHAnsi"/>
+          <w:lang w:val="vi-VN"/>
+        </w:rPr>
+        <w:lastRenderedPageBreak/>
+        <w:t>Header 1: có backend tính lịch và lấy thời tiết.</w:t>
+      </w:r>
+    </w:p>
+    <w:p>
+      <w:pPr>
+        <w:spacing w:line="240" w:lineRule="auto"/>
+        <w:rPr>
+          <w:rFonts w:cstheme="minorHAnsi"/>
+          <w:lang w:val="vi-VN"/>
+        </w:rPr>
+      </w:pPr>
+      <w:r>
+        <w:rPr>
+          <w:rFonts w:cstheme="minorHAnsi"/>
+          <w:lang w:val="vi-VN"/>
+        </w:rPr>
+        <w:tab/>
+        <w:t>Thời tiết dùng api ngoài, âm lịch tính công thức</w:t>
+      </w:r>
+    </w:p>
+    <w:p>
+      <w:pPr>
+        <w:spacing w:line="240" w:lineRule="auto"/>
+        <w:rPr>
+          <w:rFonts w:cstheme="minorHAnsi"/>
+          <w:lang w:val="vi-VN"/>
+        </w:rPr>
+      </w:pPr>
+      <w:r>
+        <w:rPr>
+          <w:rFonts w:cstheme="minorHAnsi"/>
+          <w:lang w:val="vi-VN"/>
+        </w:rPr>
+        <w:t>Header 2 : thể loại hiển thị tĩnh.</w:t>
+      </w:r>
+    </w:p>
+    <w:p>
+      <w:pPr>
+        <w:spacing w:line="240" w:lineRule="auto"/>
+        <w:rPr>
+          <w:rFonts w:cstheme="minorHAnsi"/>
+          <w:lang w:val="vi-VN"/>
+        </w:rPr>
+      </w:pPr>
+      <w:r>
+        <w:rPr>
+          <w:rFonts w:cstheme="minorHAnsi"/>
+          <w:lang w:val="vi-VN"/>
+        </w:rPr>
+        <w:tab/>
+        <w:t>Mỗi thể loại truyền id vào the-loai.html</w:t>
+      </w:r>
+    </w:p>
+    <w:p>
+      <w:pPr>
+        <w:spacing w:line="240" w:lineRule="auto"/>
+        <w:rPr>
+          <w:rFonts w:cstheme="minorHAnsi"/>
+          <w:lang w:val="vi-VN"/>
+        </w:rPr>
+      </w:pPr>
+      <w:r>
+        <w:rPr>
+          <w:rFonts w:cstheme="minorHAnsi"/>
+          <w:lang w:val="vi-VN"/>
+        </w:rPr>
+        <w:t>Body:</w:t>
+      </w:r>
+    </w:p>
+    <w:p>
+      <w:pPr>
+        <w:spacing w:line="240" w:lineRule="auto"/>
+        <w:rPr>
+          <w:rFonts w:cstheme="minorHAnsi"/>
+          <w:lang w:val="vi-VN"/>
+        </w:rPr>
+      </w:pPr>
+      <w:r>
+        <w:rPr>
+          <w:rFonts w:cstheme="minorHAnsi"/>
+          <w:lang w:val="vi-VN"/>
+        </w:rPr>
+        <w:tab/>
+        <w:t>Đánh dấu bằng ID. Sau đó gọi làm fetch.</w:t>
+      </w:r>
+    </w:p>
+    <w:p>
+      <w:pPr>
+        <w:spacing w:line="240" w:lineRule="auto"/>
+        <w:rPr>
+          <w:rFonts w:cstheme="minorHAnsi"/>
+          <w:lang w:val="vi-VN"/>
+        </w:rPr>
+      </w:pPr>
+      <w:r>
+        <w:rPr>
+          <w:rFonts w:cstheme="minorHAnsi"/>
+          <w:lang w:val="vi-VN"/>
+        </w:rPr>
+        <w:tab/>
+      </w:r>
+      <w:r>
+        <w:rPr>
+          <w:rFonts w:cstheme="minorHAnsi"/>
+          <w:lang w:val="vi-VN"/>
+        </w:rPr>
+        <w:t>Giá xăng gọi api api/gia-xang để lấy trong database.</w:t>
+      </w:r>
+    </w:p>
+    <w:p>
+      <w:pPr>
+        <w:spacing w:line="240" w:lineRule="auto"/>
+        <w:rPr>
+          <w:rFonts w:cstheme="minorHAnsi"/>
+          <w:lang w:val="vi-VN"/>
+        </w:rPr>
+      </w:pPr>
+      <w:r>
+        <w:rPr>
+          <w:rFonts w:cstheme="minorHAnsi"/>
+          <w:lang w:val="vi-VN"/>
+        </w:rPr>
+        <w:tab/>
+        <w:t>Giá vàng gọi api api/gia-vang để lấy trong database.</w:t>
+      </w:r>
+    </w:p>
+    <w:p>
+      <w:pPr>
+        <w:spacing w:line="240" w:lineRule="auto"/>
+        <w:rPr>
+          <w:rFonts w:cstheme="minorHAnsi"/>
+          <w:lang w:val="vi-VN"/>
+        </w:rPr>
+      </w:pPr>
+      <w:r>
+        <w:rPr>
+          <w:rFonts w:cstheme="minorHAnsi"/>
+          <w:lang w:val="vi-VN"/>
+        </w:rPr>
+        <w:tab/>
+        <w:t>Hàm theo dõi cuộn vô hạn, fetch 5 bài một lần.</w:t>
+      </w:r>
+    </w:p>
+    <w:p>
+      <w:pPr>
+        <w:spacing w:line="240" w:lineRule="auto"/>
+        <w:rPr>
+          <w:rFonts w:cstheme="minorHAnsi"/>
+          <w:lang w:val="vi-VN"/>
+        </w:rPr>
+      </w:pPr>
+    </w:p>
+    <w:p>
+      <w:pPr>
+        <w:spacing w:line="240" w:lineRule="auto"/>
+        <w:rPr>
+          <w:rFonts w:cstheme="minorHAnsi"/>
+          <w:lang w:val="vi-VN"/>
+        </w:rPr>
+      </w:pPr>
+      <w:r>
+        <w:rPr>
+          <w:rFonts w:cstheme="minorHAnsi"/>
+          <w:lang w:val="vi-VN"/>
+        </w:rPr>
+        <w:t xml:space="preserve">Chi-tiet: </w:t>
+      </w:r>
+    </w:p>
+    <w:p>
+      <w:pPr>
+        <w:spacing w:line="240" w:lineRule="auto"/>
+        <w:rPr>
+          <w:rFonts w:cstheme="minorHAnsi"/>
+          <w:lang w:val="vi-VN"/>
+        </w:rPr>
+      </w:pPr>
+      <w:r>
+        <w:rPr>
+          <w:rFonts w:cstheme="minorHAnsi"/>
+          <w:lang w:val="vi-VN"/>
+        </w:rPr>
+        <w:tab/>
+        <w:t>Lấy bài báo, lọc nội dung lấy vị trí ảnh: [Anh xx]</w:t>
+      </w:r>
+    </w:p>
+    <w:p>
+      <w:pPr>
+        <w:spacing w:line="240" w:lineRule="auto"/>
+        <w:rPr>
+          <w:rFonts w:cstheme="minorHAnsi"/>
+          <w:lang w:val="vi-VN"/>
+        </w:rPr>
+      </w:pPr>
+      <w:r>
+        <w:rPr>
+          <w:rFonts w:cstheme="minorHAnsi"/>
+          <w:lang w:val="vi-VN"/>
+        </w:rPr>
+        <w:t>Banner quảng cáo lấy link trong database tùy theo vị trí.</w:t>
+      </w:r>
+    </w:p>
+    <w:p>
+      <w:pPr>
+        <w:spacing w:line="240" w:lineRule="auto"/>
+        <w:rPr>
+          <w:rFonts w:cstheme="minorHAnsi"/>
+          <w:lang w:val="vi-VN"/>
+        </w:rPr>
+      </w:pPr>
+    </w:p>
+    <w:p>
+      <w:pPr>
+        <w:spacing w:line="240" w:lineRule="auto"/>
+        <w:rPr>
+          <w:rFonts w:cstheme="minorHAnsi"/>
+          <w:lang w:val="vi-VN"/>
+        </w:rPr>
+      </w:pPr>
+    </w:p>
+    <w:p>
+      <w:pPr>
+        <w:spacing w:line="240" w:lineRule="auto"/>
+        <w:rPr>
+          <w:rFonts w:cstheme="minorHAnsi"/>
+          <w:lang w:val="vi-VN"/>
+        </w:rPr>
+      </w:pPr>
+    </w:p>
+    <w:p>
+      <w:pPr>
+        <w:spacing w:line="240" w:lineRule="auto"/>
+        <w:rPr>
+          <w:rFonts w:cstheme="minorHAnsi"/>
+          <w:lang w:val="vi-VN"/>
+        </w:rPr>
+      </w:pPr>
+    </w:p>
+    <w:p>
+      <w:pPr>
+        <w:spacing w:line="240" w:lineRule="auto"/>
+        <w:rPr>
+          <w:rFonts w:cstheme="minorHAnsi"/>
+          <w:lang w:val="vi-VN"/>
+        </w:rPr>
+      </w:pPr>
+    </w:p>
+    <w:p>
+      <w:pPr>
+        <w:spacing w:line="240" w:lineRule="auto"/>
+        <w:rPr>
+          <w:rFonts w:cstheme="minorHAnsi"/>
+          <w:lang w:val="vi-VN"/>
+        </w:rPr>
+      </w:pPr>
+    </w:p>
+    <w:p>
+      <w:pPr>
+        <w:spacing w:line="240" w:lineRule="auto"/>
+        <w:rPr>
+          <w:rFonts w:cstheme="minorHAnsi"/>
+          <w:lang w:val="vi-VN"/>
+        </w:rPr>
+      </w:pPr>
+    </w:p>
+    <w:p>
+      <w:pPr>
+        <w:spacing w:line="240" w:lineRule="auto"/>
         <w:ind w:left="360"/>
         <w:rPr>
           <w:rFonts w:cstheme="minorHAnsi"/>
@@ -1347,7 +1635,6 @@
           <w:b/>
           <w:bCs/>
         </w:rPr>
-        <w:lastRenderedPageBreak/>
         <w:t>users</w:t>
       </w:r>
     </w:p>
@@ -1823,6 +2110,7 @@
         <w:rPr>
           <w:rFonts w:cstheme="minorHAnsi"/>
         </w:rPr>
+        <w:lastRenderedPageBreak/>
         <w:t xml:space="preserve">description: </w:t>
       </w:r>
       <w:proofErr w:type="gramStart"/>
@@ -2449,7 +2737,6 @@
         <w:rPr>
           <w:rFonts w:cstheme="minorHAnsi"/>
         </w:rPr>
-        <w:lastRenderedPageBreak/>
         <w:t>advertiser_id: int</w:t>
       </w:r>
     </w:p>
@@ -2641,6 +2928,23 @@
         </w:rPr>
         <w:t>30)</w:t>
       </w:r>
+      <w:r>
+        <w:rPr>
+          <w:rFonts w:cstheme="minorHAnsi"/>
+          <w:lang w:val="vi-VN"/>
+        </w:rPr>
+        <w:tab/>
+        <w:t xml:space="preserve">daduyet, chuaduyet, quahan, </w:t>
+      </w:r>
+      <w:proofErr w:type="gramStart"/>
+      <w:r>
+        <w:rPr>
+          <w:rFonts w:cstheme="minorHAnsi"/>
+          <w:lang w:val="vi-VN"/>
+        </w:rPr>
+        <w:t>dathanhtoan,tuchoi</w:t>
+      </w:r>
+      <w:proofErr w:type="gramEnd"/>
     </w:p>
     <w:p>
       <w:pPr>
@@ -2731,6 +3035,26 @@
         </w:rPr>
         <w:t>created_at: datetime2</w:t>
       </w:r>
+    </w:p>
+    <w:p>
+      <w:pPr>
+        <w:pStyle w:val="ListParagraph"/>
+        <w:spacing w:line="240" w:lineRule="auto"/>
+        <w:rPr>
+          <w:rFonts w:cstheme="minorHAnsi"/>
+          <w:lang w:val="vi-VN"/>
+        </w:rPr>
+      </w:pPr>
+    </w:p>
+    <w:p>
+      <w:pPr>
+        <w:pStyle w:val="ListParagraph"/>
+        <w:spacing w:line="240" w:lineRule="auto"/>
+        <w:rPr>
+          <w:rFonts w:cstheme="minorHAnsi"/>
+          <w:lang w:val="vi-VN"/>
+        </w:rPr>
+      </w:pPr>
     </w:p>
     <w:p>
       <w:pPr>
@@ -2816,6 +3140,7 @@
           <w:b/>
           <w:bCs/>
         </w:rPr>
+        <w:lastRenderedPageBreak/>
         <w:t>pin_</w:t>
       </w:r>
       <w:r>
@@ -5529,6 +5854,7 @@
   <w:style w:type="character" w:default="1" w:styleId="DefaultParagraphFont">
     <w:name w:val="Default Paragraph Font"/>
     <w:uiPriority w:val="1"/>
+    <w:semiHidden/>
     <w:unhideWhenUsed/>
   </w:style>
   <w:style w:type="table" w:default="1" w:styleId="TableNormal">
@@ -6186,4 +6512,16 @@
     </a:ext>
   </a:extLst>
 </a:theme>
+</file>
+
+<file path=customXml/item1.xml><?xml version="1.0" encoding="utf-8"?>
+<b:Sources xmlns:b="http://schemas.openxmlformats.org/officeDocument/2006/bibliography" xmlns="http://schemas.openxmlformats.org/officeDocument/2006/bibliography" SelectedStyle="\APASixthEditionOfficeOnline.xsl" StyleName="APA" Version="6"/>
+</file>
+
+<file path=customXml/itemProps1.xml><?xml version="1.0" encoding="utf-8"?>
+<ds:datastoreItem xmlns:ds="http://schemas.openxmlformats.org/officeDocument/2006/customXml" ds:itemID="{EEA1B207-D87D-49D6-81D6-B4024464E7B9}">
+  <ds:schemaRefs>
+    <ds:schemaRef ds:uri="http://schemas.openxmlformats.org/officeDocument/2006/bibliography"/>
+  </ds:schemaRefs>
+</ds:datastoreItem>
 </file>
</xml_diff>